<commit_message>
op lab 6 update
</commit_message>
<xml_diff>
--- a/digital-modeling/4 Лаба/Отчет.docx
+++ b/digital-modeling/4 Лаба/Отчет.docx
@@ -2045,18 +2045,18 @@
           <w:kern w:val="0"/>
           <w:sz w:val="28"/>
           <w:szCs w:val="20"/>
-          <w:lang w:eastAsia="ru-RU"/>
-          <w14:ligatures w14:val="none"/>
-        </w:rPr>
-      </w:pPr>
-      <w:r>
-        <w:rPr>
-          <w:rFonts w:ascii="Times New Roman" w:eastAsia="Times New Roman" w:hAnsi="Times New Roman" w:cs="Times New Roman"/>
-          <w:color w:val="00000A"/>
-          <w:kern w:val="0"/>
-          <w:sz w:val="28"/>
-          <w:szCs w:val="20"/>
-          <w:lang w:eastAsia="ru-RU"/>
+          <w:lang w:val="en-US" w:eastAsia="ru-RU"/>
+          <w14:ligatures w14:val="none"/>
+        </w:rPr>
+      </w:pPr>
+      <w:r>
+        <w:rPr>
+          <w:rFonts w:ascii="Times New Roman" w:eastAsia="Times New Roman" w:hAnsi="Times New Roman" w:cs="Times New Roman"/>
+          <w:color w:val="00000A"/>
+          <w:kern w:val="0"/>
+          <w:sz w:val="28"/>
+          <w:szCs w:val="20"/>
+          <w:lang w:val="en-US" w:eastAsia="ru-RU"/>
           <w14:ligatures w14:val="none"/>
         </w:rPr>
         <w:t xml:space="preserve">x1_exp = </w:t>
@@ -2070,7 +2070,7 @@
           <w:kern w:val="0"/>
           <w:sz w:val="28"/>
           <w:szCs w:val="20"/>
-          <w:lang w:eastAsia="ru-RU"/>
+          <w:lang w:val="en-US" w:eastAsia="ru-RU"/>
           <w14:ligatures w14:val="none"/>
         </w:rPr>
         <w:t>np.array</w:t>
@@ -2084,7 +2084,7 @@
           <w:kern w:val="0"/>
           <w:sz w:val="28"/>
           <w:szCs w:val="20"/>
-          <w:lang w:eastAsia="ru-RU"/>
+          <w:lang w:val="en-US" w:eastAsia="ru-RU"/>
           <w14:ligatures w14:val="none"/>
         </w:rPr>
         <w:t>([0.100, 0.300, 0.500, 0.700, 0.900])</w:t>
@@ -6355,6 +6355,22 @@
           </wp:inline>
         </w:drawing>
       </w:r>
+    </w:p>
+    <w:p>
+      <w:pPr>
+        <w:suppressAutoHyphens/>
+        <w:spacing w:after="200" w:line="240" w:lineRule="auto"/>
+        <w:jc w:val="both"/>
+        <w:rPr>
+          <w:rFonts w:ascii="Times New Roman" w:eastAsia="Times New Roman" w:hAnsi="Times New Roman" w:cs="Times New Roman"/>
+          <w:color w:val="00000A"/>
+          <w:kern w:val="0"/>
+          <w:sz w:val="28"/>
+          <w:szCs w:val="20"/>
+          <w:lang w:val="en-US" w:eastAsia="ru-RU"/>
+          <w14:ligatures w14:val="none"/>
+        </w:rPr>
+      </w:pPr>
       <w:r>
         <w:rPr>
           <w:rFonts w:ascii="Times New Roman" w:eastAsia="Times New Roman" w:hAnsi="Times New Roman" w:cs="Times New Roman"/>
@@ -7029,6 +7045,7 @@
   <w:style w:type="character" w:default="1" w:styleId="a0">
     <w:name w:val="Default Paragraph Font"/>
     <w:uiPriority w:val="1"/>
+    <w:semiHidden/>
     <w:unhideWhenUsed/>
   </w:style>
   <w:style w:type="table" w:default="1" w:styleId="a1">

</xml_diff>